<commit_message>
Centralise references on the shared citation key sheet
- literature.bib rekeyed to ref_<n>; background.tex citations follow.
- CONTRIBUTING 1.6 and all four .tex templates state the workflow: declare
  every source in the sheet, cite by key, never edit the .bib directly.
  Adds the academic integrity and Turnitin requirements.
- .docx templates regenerated from style_donor.docx, which is a style
  source rather than a template anyone writes in.
- notebooks/about_me_template.md: who owns a notebook folder.
- ARCHITECTURE 5 is now the Sect. 8 comparison flow -- the unit is a
  configuration (KMeans, PCA -> KMeans), not a method, and the two tables
  aggregate at different granularity.
</commit_message>
<xml_diff>
--- a/AI/cluster_analysis/template/dimreduction_template.docx
+++ b/AI/cluster_analysis/template/dimreduction_template.docx
@@ -73,7 +73,7 @@
           <w:sz w:val="21"/>
           <w:szCs w:val="21"/>
         </w:rPr>
-        <w:t xml:space="preserve">Keep the eleven parts in the order given. The comparison section aggregates across techniques part by part, so a merged or renamed part cannot be compared with the others.</w:t>
+        <w:t xml:space="preserve">Keep the twelve parts in the order given. The comparison section aggregates across techniques part by part, so a merged or renamed part cannot be compared with the others.</w:t>
       </w:r>
     </w:p>
     <w:p>
@@ -127,6 +127,100 @@
           <w:szCs w:val="21"/>
         </w:rPr>
         <w:t xml:space="preserve">Use the symbols declared in the shared notation table. Do not introduce private notation.</w:t>
+      </w:r>
+    </w:p>
+    <w:p>
+      <w:pPr>
+        <w:shd w:fill="F2F5F8" w:color="auto" w:val="clear"/>
+        <w:spacing w:after="140"/>
+        <w:ind w:left="200" w:right="200"/>
+      </w:pPr>
+      <w:r>
+        <w:rPr>
+          <w:b/>
+          <w:bCs/>
+          <w:color w:val="1F3A5F"/>
+          <w:sz w:val="24"/>
+          <w:szCs w:val="24"/>
+        </w:rPr>
+        <w:t xml:space="preserve">References — declare, then cite</w:t>
+      </w:r>
+    </w:p>
+    <w:p>
+      <w:pPr>
+        <w:spacing w:after="120"/>
+      </w:pPr>
+      <w:r>
+        <w:rPr>
+          <w:sz w:val="21"/>
+          <w:szCs w:val="21"/>
+        </w:rPr>
+        <w:t xml:space="preserve">Every source you use is declared in the shared citation key mapping sheet, and nowhere else. Everyone's references go in the same sheet: https://deakin365-my.sharepoint.com/:x:/g/personal/s224236373_deakin_edu_au/IQDSW3PBbHhZSq6vzGGQqi3WAbgJ1id1-t02k5B6fduX5Ys?e=nShY5e</w:t>
+      </w:r>
+    </w:p>
+    <w:p>
+      <w:pPr>
+        <w:spacing w:after="120"/>
+      </w:pPr>
+      <w:r>
+        <w:rPr>
+          <w:sz w:val="21"/>
+          <w:szCs w:val="21"/>
+        </w:rPr>
+        <w:t xml:space="preserve">Each entry there carries a key of the form ref_&lt;n&gt;. Refer to a source by that key in your text — "the objective of ref_12" — and list it in the References part at the end of this template. The document lead turns those keys into the document's citations; do not edit literature.bib yourself, and do not invent your own key.</w:t>
+      </w:r>
+    </w:p>
+    <w:p>
+      <w:pPr>
+        <w:spacing w:after="120"/>
+      </w:pPr>
+      <w:r>
+        <w:rPr>
+          <w:sz w:val="21"/>
+          <w:szCs w:val="21"/>
+        </w:rPr>
+        <w:t xml:space="preserve">Cite in the part where the claim is made, not in a lump at the end. Every formulation, every published result and every parameter value taken from the literature carries its own reference.</w:t>
+      </w:r>
+    </w:p>
+    <w:p>
+      <w:pPr>
+        <w:shd w:fill="F2F5F8" w:color="auto" w:val="clear"/>
+        <w:spacing w:after="140"/>
+        <w:ind w:left="200" w:right="200"/>
+      </w:pPr>
+      <w:r>
+        <w:rPr>
+          <w:b/>
+          <w:bCs/>
+          <w:color w:val="1F3A5F"/>
+          <w:sz w:val="24"/>
+          <w:szCs w:val="24"/>
+        </w:rPr>
+        <w:t xml:space="preserve">Academic integrity</w:t>
+      </w:r>
+    </w:p>
+    <w:p>
+      <w:pPr>
+        <w:spacing w:after="120"/>
+      </w:pPr>
+      <w:r>
+        <w:rPr>
+          <w:sz w:val="21"/>
+          <w:szCs w:val="21"/>
+        </w:rPr>
+        <w:t xml:space="preserve">An uncited claim, figure, equation, table or code fragment is plagiarism, whether it came from a paper, a library's documentation, a teammate, or a generative AI tool. Quote and cite it, or write it yourself. Declare AI assistance as Deakin policy requires.</w:t>
+      </w:r>
+    </w:p>
+    <w:p>
+      <w:pPr>
+        <w:spacing w:after="120"/>
+      </w:pPr>
+      <w:r>
+        <w:rPr>
+          <w:sz w:val="21"/>
+          <w:szCs w:val="21"/>
+        </w:rPr>
+        <w:t xml:space="preserve">Before opening the pull request, run your section through Turnitin. Do not commit the report — the repository is not where it belongs. Paste the similarity summary into the pull request as an image, or send it to the document lead privately; the lead may also run the check later. Turnitin is available to Deakin students. Policy and procedure: https://d2l.deakin.edu.au/d2l/le/content/93067/viewContent/5882569/View</w:t>
       </w:r>
     </w:p>
     <w:p>
@@ -1152,6 +1246,377 @@
     </w:p>
     <w:p>
       <w:pPr>
+        <w:pStyle w:val="Heading4"/>
+      </w:pPr>
+      <w:r>
+        <w:t xml:space="preserve">12. References</w:t>
+      </w:r>
+    </w:p>
+    <w:p>
+      <w:pPr>
+        <w:spacing w:after="200" w:before="60"/>
+      </w:pPr>
+      <w:r>
+        <w:rPr>
+          <w:i/>
+          <w:iCs/>
+          <w:color w:val="595959"/>
+          <w:sz w:val="21"/>
+          <w:szCs w:val="21"/>
+        </w:rPr>
+        <w:t xml:space="preserve">[Every source this write-up draws on, listed by its ref_&lt;n&gt; key from the citation key mapping sheet — including anything you read and did not cite, since a reviewer needs to see what the write-up rests on and not only what it quotes. Declare the source in the sheet first; the key comes from there. Fill in the table below.]</w:t>
+      </w:r>
+    </w:p>
+    <w:tbl>
+      <w:tblPr>
+        <w:tblW w:type="dxa" w:w="9000"/>
+        <w:tblBorders>
+          <w:top w:val="single" w:color="auto" w:sz="4"/>
+          <w:left w:val="single" w:color="auto" w:sz="4"/>
+          <w:bottom w:val="single" w:color="auto" w:sz="4"/>
+          <w:right w:val="single" w:color="auto" w:sz="4"/>
+          <w:insideH w:val="single" w:color="auto" w:sz="4"/>
+          <w:insideV w:val="single" w:color="auto" w:sz="4"/>
+        </w:tblBorders>
+      </w:tblPr>
+      <w:tblGrid>
+        <w:gridCol w:w="1200"/>
+        <w:gridCol w:w="4800"/>
+        <w:gridCol w:w="3000"/>
+      </w:tblGrid>
+      <w:tr>
+        <w:trPr>
+          <w:tblHeader/>
+        </w:trPr>
+        <w:tc>
+          <w:tcPr>
+            <w:tcW w:type="dxa" w:w="1200"/>
+            <w:shd w:fill="1F3A5F" w:color="auto" w:val="clear"/>
+            <w:tcMar>
+              <w:top w:type="dxa" w:w="80"/>
+              <w:left w:type="dxa" w:w="100"/>
+              <w:bottom w:type="dxa" w:w="80"/>
+              <w:right w:type="dxa" w:w="100"/>
+            </w:tcMar>
+          </w:tcPr>
+          <w:p>
+            <w:r>
+              <w:rPr>
+                <w:b/>
+                <w:bCs/>
+                <w:color w:val="FFFFFF"/>
+                <w:sz w:val="20"/>
+                <w:szCs w:val="20"/>
+              </w:rPr>
+              <w:t xml:space="preserve">Ref key</w:t>
+            </w:r>
+          </w:p>
+        </w:tc>
+        <w:tc>
+          <w:tcPr>
+            <w:tcW w:type="dxa" w:w="4800"/>
+            <w:shd w:fill="1F3A5F" w:color="auto" w:val="clear"/>
+            <w:tcMar>
+              <w:top w:type="dxa" w:w="80"/>
+              <w:left w:type="dxa" w:w="100"/>
+              <w:bottom w:type="dxa" w:w="80"/>
+              <w:right w:type="dxa" w:w="100"/>
+            </w:tcMar>
+          </w:tcPr>
+          <w:p>
+            <w:r>
+              <w:rPr>
+                <w:b/>
+                <w:bCs/>
+                <w:color w:val="FFFFFF"/>
+                <w:sz w:val="20"/>
+                <w:szCs w:val="20"/>
+              </w:rPr>
+              <w:t xml:space="preserve">Source (author, year, title)</w:t>
+            </w:r>
+          </w:p>
+        </w:tc>
+        <w:tc>
+          <w:tcPr>
+            <w:tcW w:type="dxa" w:w="3000"/>
+            <w:shd w:fill="1F3A5F" w:color="auto" w:val="clear"/>
+            <w:tcMar>
+              <w:top w:type="dxa" w:w="80"/>
+              <w:left w:type="dxa" w:w="100"/>
+              <w:bottom w:type="dxa" w:w="80"/>
+              <w:right w:type="dxa" w:w="100"/>
+            </w:tcMar>
+          </w:tcPr>
+          <w:p>
+            <w:r>
+              <w:rPr>
+                <w:b/>
+                <w:bCs/>
+                <w:color w:val="FFFFFF"/>
+                <w:sz w:val="20"/>
+                <w:szCs w:val="20"/>
+              </w:rPr>
+              <w:t xml:space="preserve">Where used</w:t>
+            </w:r>
+          </w:p>
+        </w:tc>
+      </w:tr>
+      <w:tr>
+        <w:tc>
+          <w:tcPr>
+            <w:tcW w:type="dxa" w:w="1200"/>
+            <w:tcMar>
+              <w:top w:type="dxa" w:w="80"/>
+              <w:left w:type="dxa" w:w="100"/>
+              <w:bottom w:type="dxa" w:w="80"/>
+              <w:right w:type="dxa" w:w="100"/>
+            </w:tcMar>
+          </w:tcPr>
+          <w:p>
+            <w:r>
+              <w:rPr>
+                <w:sz w:val="20"/>
+                <w:szCs w:val="20"/>
+              </w:rPr>
+              <w:t xml:space="preserve"/>
+            </w:r>
+          </w:p>
+        </w:tc>
+        <w:tc>
+          <w:tcPr>
+            <w:tcW w:type="dxa" w:w="4800"/>
+            <w:tcMar>
+              <w:top w:type="dxa" w:w="80"/>
+              <w:left w:type="dxa" w:w="100"/>
+              <w:bottom w:type="dxa" w:w="80"/>
+              <w:right w:type="dxa" w:w="100"/>
+            </w:tcMar>
+          </w:tcPr>
+          <w:p>
+            <w:r>
+              <w:rPr>
+                <w:sz w:val="20"/>
+                <w:szCs w:val="20"/>
+              </w:rPr>
+              <w:t xml:space="preserve"/>
+            </w:r>
+          </w:p>
+        </w:tc>
+        <w:tc>
+          <w:tcPr>
+            <w:tcW w:type="dxa" w:w="3000"/>
+            <w:tcMar>
+              <w:top w:type="dxa" w:w="80"/>
+              <w:left w:type="dxa" w:w="100"/>
+              <w:bottom w:type="dxa" w:w="80"/>
+              <w:right w:type="dxa" w:w="100"/>
+            </w:tcMar>
+          </w:tcPr>
+          <w:p>
+            <w:r>
+              <w:rPr>
+                <w:sz w:val="20"/>
+                <w:szCs w:val="20"/>
+              </w:rPr>
+              <w:t xml:space="preserve"/>
+            </w:r>
+          </w:p>
+        </w:tc>
+      </w:tr>
+      <w:tr>
+        <w:tc>
+          <w:tcPr>
+            <w:tcW w:type="dxa" w:w="1200"/>
+            <w:tcMar>
+              <w:top w:type="dxa" w:w="80"/>
+              <w:left w:type="dxa" w:w="100"/>
+              <w:bottom w:type="dxa" w:w="80"/>
+              <w:right w:type="dxa" w:w="100"/>
+            </w:tcMar>
+          </w:tcPr>
+          <w:p>
+            <w:r>
+              <w:rPr>
+                <w:sz w:val="20"/>
+                <w:szCs w:val="20"/>
+              </w:rPr>
+              <w:t xml:space="preserve"/>
+            </w:r>
+          </w:p>
+        </w:tc>
+        <w:tc>
+          <w:tcPr>
+            <w:tcW w:type="dxa" w:w="4800"/>
+            <w:tcMar>
+              <w:top w:type="dxa" w:w="80"/>
+              <w:left w:type="dxa" w:w="100"/>
+              <w:bottom w:type="dxa" w:w="80"/>
+              <w:right w:type="dxa" w:w="100"/>
+            </w:tcMar>
+          </w:tcPr>
+          <w:p>
+            <w:r>
+              <w:rPr>
+                <w:sz w:val="20"/>
+                <w:szCs w:val="20"/>
+              </w:rPr>
+              <w:t xml:space="preserve"/>
+            </w:r>
+          </w:p>
+        </w:tc>
+        <w:tc>
+          <w:tcPr>
+            <w:tcW w:type="dxa" w:w="3000"/>
+            <w:tcMar>
+              <w:top w:type="dxa" w:w="80"/>
+              <w:left w:type="dxa" w:w="100"/>
+              <w:bottom w:type="dxa" w:w="80"/>
+              <w:right w:type="dxa" w:w="100"/>
+            </w:tcMar>
+          </w:tcPr>
+          <w:p>
+            <w:r>
+              <w:rPr>
+                <w:sz w:val="20"/>
+                <w:szCs w:val="20"/>
+              </w:rPr>
+              <w:t xml:space="preserve"/>
+            </w:r>
+          </w:p>
+        </w:tc>
+      </w:tr>
+      <w:tr>
+        <w:tc>
+          <w:tcPr>
+            <w:tcW w:type="dxa" w:w="1200"/>
+            <w:tcMar>
+              <w:top w:type="dxa" w:w="80"/>
+              <w:left w:type="dxa" w:w="100"/>
+              <w:bottom w:type="dxa" w:w="80"/>
+              <w:right w:type="dxa" w:w="100"/>
+            </w:tcMar>
+          </w:tcPr>
+          <w:p>
+            <w:r>
+              <w:rPr>
+                <w:sz w:val="20"/>
+                <w:szCs w:val="20"/>
+              </w:rPr>
+              <w:t xml:space="preserve"/>
+            </w:r>
+          </w:p>
+        </w:tc>
+        <w:tc>
+          <w:tcPr>
+            <w:tcW w:type="dxa" w:w="4800"/>
+            <w:tcMar>
+              <w:top w:type="dxa" w:w="80"/>
+              <w:left w:type="dxa" w:w="100"/>
+              <w:bottom w:type="dxa" w:w="80"/>
+              <w:right w:type="dxa" w:w="100"/>
+            </w:tcMar>
+          </w:tcPr>
+          <w:p>
+            <w:r>
+              <w:rPr>
+                <w:sz w:val="20"/>
+                <w:szCs w:val="20"/>
+              </w:rPr>
+              <w:t xml:space="preserve"/>
+            </w:r>
+          </w:p>
+        </w:tc>
+        <w:tc>
+          <w:tcPr>
+            <w:tcW w:type="dxa" w:w="3000"/>
+            <w:tcMar>
+              <w:top w:type="dxa" w:w="80"/>
+              <w:left w:type="dxa" w:w="100"/>
+              <w:bottom w:type="dxa" w:w="80"/>
+              <w:right w:type="dxa" w:w="100"/>
+            </w:tcMar>
+          </w:tcPr>
+          <w:p>
+            <w:r>
+              <w:rPr>
+                <w:sz w:val="20"/>
+                <w:szCs w:val="20"/>
+              </w:rPr>
+              <w:t xml:space="preserve"/>
+            </w:r>
+          </w:p>
+        </w:tc>
+      </w:tr>
+      <w:tr>
+        <w:tc>
+          <w:tcPr>
+            <w:tcW w:type="dxa" w:w="1200"/>
+            <w:tcMar>
+              <w:top w:type="dxa" w:w="80"/>
+              <w:left w:type="dxa" w:w="100"/>
+              <w:bottom w:type="dxa" w:w="80"/>
+              <w:right w:type="dxa" w:w="100"/>
+            </w:tcMar>
+          </w:tcPr>
+          <w:p>
+            <w:r>
+              <w:rPr>
+                <w:sz w:val="20"/>
+                <w:szCs w:val="20"/>
+              </w:rPr>
+              <w:t xml:space="preserve"/>
+            </w:r>
+          </w:p>
+        </w:tc>
+        <w:tc>
+          <w:tcPr>
+            <w:tcW w:type="dxa" w:w="4800"/>
+            <w:tcMar>
+              <w:top w:type="dxa" w:w="80"/>
+              <w:left w:type="dxa" w:w="100"/>
+              <w:bottom w:type="dxa" w:w="80"/>
+              <w:right w:type="dxa" w:w="100"/>
+            </w:tcMar>
+          </w:tcPr>
+          <w:p>
+            <w:r>
+              <w:rPr>
+                <w:sz w:val="20"/>
+                <w:szCs w:val="20"/>
+              </w:rPr>
+              <w:t xml:space="preserve"/>
+            </w:r>
+          </w:p>
+        </w:tc>
+        <w:tc>
+          <w:tcPr>
+            <w:tcW w:type="dxa" w:w="3000"/>
+            <w:tcMar>
+              <w:top w:type="dxa" w:w="80"/>
+              <w:left w:type="dxa" w:w="100"/>
+              <w:bottom w:type="dxa" w:w="80"/>
+              <w:right w:type="dxa" w:w="100"/>
+            </w:tcMar>
+          </w:tcPr>
+          <w:p>
+            <w:r>
+              <w:rPr>
+                <w:sz w:val="20"/>
+                <w:szCs w:val="20"/>
+              </w:rPr>
+              <w:t xml:space="preserve"/>
+            </w:r>
+          </w:p>
+        </w:tc>
+      </w:tr>
+    </w:tbl>
+    <w:p>
+      <w:pPr>
+        <w:spacing w:after="160"/>
+      </w:pPr>
+    </w:p>
+    <w:p>
+      <w:pPr>
         <w:pStyle w:val="Heading3"/>
       </w:pPr>
       <w:r>
@@ -1169,7 +1634,7 @@
           <w:sz w:val="21"/>
           <w:szCs w:val="21"/>
         </w:rPr>
-        <w:t xml:space="preserve">All eleven parts present, in the given order, none merged or renamed.</w:t>
+        <w:t xml:space="preserve">All twelve parts present, in the given order, none merged or renamed.</w:t>
       </w:r>
     </w:p>
     <w:p>
@@ -1281,7 +1746,7 @@
           <w:sz w:val="21"/>
           <w:szCs w:val="21"/>
         </w:rPr>
-        <w:t xml:space="preserve">Original source of the technique cited.</w:t>
+        <w:t xml:space="preserve">Original source of the technique cited, in the part where the claim is made.</w:t>
       </w:r>
     </w:p>
     <w:p>
@@ -1295,7 +1760,7 @@
           <w:sz w:val="21"/>
           <w:szCs w:val="21"/>
         </w:rPr>
-        <w:t xml:space="preserve">Figures numbered, captioned, and referred to in the text.</w:t>
+        <w:t xml:space="preserve">Every source declared in the citation key mapping sheet and referred to by its ref_&lt;n&gt; key.</w:t>
       </w:r>
     </w:p>
     <w:p>
@@ -1309,7 +1774,7 @@
           <w:sz w:val="21"/>
           <w:szCs w:val="21"/>
         </w:rPr>
-        <w:t xml:space="preserve">Headings left at Heading 3 / Heading 4 so the file assembles correctly.</w:t>
+        <w:t xml:space="preserve">References part filled in, including sources read but not cited.</w:t>
       </w:r>
     </w:p>
     <w:p>
@@ -1323,7 +1788,49 @@
           <w:sz w:val="21"/>
           <w:szCs w:val="21"/>
         </w:rPr>
+        <w:t xml:space="preserve">Figures numbered, captioned, and referred to in the text.</w:t>
+      </w:r>
+    </w:p>
+    <w:p>
+      <w:pPr>
+        <w:pStyle w:val="ListParagraph"/>
+        <w:spacing w:after="40"/>
+        <w:ind w:left="360"/>
+      </w:pPr>
+      <w:r>
+        <w:rPr>
+          <w:sz w:val="21"/>
+          <w:szCs w:val="21"/>
+        </w:rPr>
+        <w:t xml:space="preserve">Headings left at Heading 3 / Heading 4 so the file assembles correctly.</w:t>
+      </w:r>
+    </w:p>
+    <w:p>
+      <w:pPr>
+        <w:pStyle w:val="ListParagraph"/>
+        <w:spacing w:after="40"/>
+        <w:ind w:left="360"/>
+      </w:pPr>
+      <w:r>
+        <w:rPr>
+          <w:sz w:val="21"/>
+          <w:szCs w:val="21"/>
+        </w:rPr>
         <w:t xml:space="preserve">AI assistance declared per Deakin policy if used in drafting.</w:t>
+      </w:r>
+    </w:p>
+    <w:p>
+      <w:pPr>
+        <w:pStyle w:val="ListParagraph"/>
+        <w:spacing w:after="40"/>
+        <w:ind w:left="360"/>
+      </w:pPr>
+      <w:r>
+        <w:rPr>
+          <w:sz w:val="21"/>
+          <w:szCs w:val="21"/>
+        </w:rPr>
+        <w:t xml:space="preserve">Turnitin run; the report shared with the document lead, not committed.</w:t>
       </w:r>
     </w:p>
     <w:p>

</xml_diff>